<commit_message>
docs: actualizado plan de empresa
</commit_message>
<xml_diff>
--- a/documentacion proyecto/Proyecto Final - Plan Empresa.docx
+++ b/documentacion proyecto/Proyecto Final - Plan Empresa.docx
@@ -6978,7 +6978,15 @@
         <w:t>aplicación</w:t>
       </w:r>
       <w:r>
-        <w:t xml:space="preserve"> SaaS de gestión de TPVs o Terminales de Punto de Venta </w:t>
+        <w:t xml:space="preserve"> SaaS de gestión de </w:t>
+      </w:r>
+      <w:proofErr w:type="spellStart"/>
+      <w:r>
+        <w:t>TPVs</w:t>
+      </w:r>
+      <w:proofErr w:type="spellEnd"/>
+      <w:r>
+        <w:t xml:space="preserve"> o Terminales de Punto de Venta </w:t>
       </w:r>
     </w:p>
     <w:p>
@@ -6986,11 +6994,24 @@
         <w:jc w:val="both"/>
       </w:pPr>
       <w:r>
-        <w:t>Dentro del mundo del software SaaS (Software as a service) o Aplicaciones como servicio nos podemos encontrar muchas alternativas ya establecidas que dan servicio, pero</w:t>
-      </w:r>
-      <w:r>
-        <w:t xml:space="preserve"> que</w:t>
-      </w:r>
+        <w:t xml:space="preserve">Dentro del mundo del software SaaS (Software as a </w:t>
+      </w:r>
+      <w:proofErr w:type="spellStart"/>
+      <w:r>
+        <w:t>service</w:t>
+      </w:r>
+      <w:proofErr w:type="spellEnd"/>
+      <w:r>
+        <w:t>) o Aplicaciones como servicio nos podemos encontrar muchas alternativas ya establecidas que dan servicio, pero</w:t>
+      </w:r>
+      <w:r>
+        <w:t xml:space="preserve"> </w:t>
+      </w:r>
+      <w:proofErr w:type="gramStart"/>
+      <w:r>
+        <w:t>que</w:t>
+      </w:r>
+      <w:proofErr w:type="gramEnd"/>
       <w:r>
         <w:t xml:space="preserve"> desde</w:t>
       </w:r>
@@ -7040,13 +7061,29 @@
         <w:jc w:val="both"/>
       </w:pPr>
       <w:r>
-        <w:t xml:space="preserve">La idea de negocio es crear una empresa de consultoría de software web. Con este fin, he creado Xiaomao Devs donde nos centramos en la creación de páginas web y otras soluciones web, </w:t>
+        <w:t xml:space="preserve">La idea de negocio es crear una empresa de consultoría de software web. Con este fin, he creado </w:t>
+      </w:r>
+      <w:proofErr w:type="spellStart"/>
+      <w:r>
+        <w:t>Xiaomao</w:t>
+      </w:r>
+      <w:proofErr w:type="spellEnd"/>
+      <w:r>
+        <w:t xml:space="preserve"> Devs donde nos centramos en la creación de páginas web y otras soluciones web, </w:t>
       </w:r>
       <w:r>
         <w:t>donde nuestra aplicación principal es</w:t>
       </w:r>
       <w:r>
-        <w:t xml:space="preserve"> Bsnessapp. </w:t>
+        <w:t xml:space="preserve"> </w:t>
+      </w:r>
+      <w:proofErr w:type="spellStart"/>
+      <w:r>
+        <w:t>Bsnessapp</w:t>
+      </w:r>
+      <w:proofErr w:type="spellEnd"/>
+      <w:r>
+        <w:t xml:space="preserve">. </w:t>
       </w:r>
     </w:p>
     <w:p>
@@ -7062,7 +7099,23 @@
         <w:jc w:val="both"/>
       </w:pPr>
       <w:r>
-        <w:t>- Servicios de consultoría y desarrollo web: asesoramiento técnico, personalización de soluciones y desarrollo a medida para clientes que necesiten integraciones o adaptaciones específicas en el mundo web. Como soluciones ecommerce, CRMs web o páginas estáticas donde el cliente quiera mostrar información suya para captar clientes.</w:t>
+        <w:t xml:space="preserve">- Servicios de consultoría y desarrollo web: asesoramiento técnico, personalización de soluciones y desarrollo a medida para clientes que necesiten integraciones o adaptaciones específicas en el mundo web. Como soluciones </w:t>
+      </w:r>
+      <w:proofErr w:type="spellStart"/>
+      <w:r>
+        <w:t>ecommerce</w:t>
+      </w:r>
+      <w:proofErr w:type="spellEnd"/>
+      <w:r>
+        <w:t xml:space="preserve">, </w:t>
+      </w:r>
+      <w:proofErr w:type="spellStart"/>
+      <w:r>
+        <w:t>CRMs</w:t>
+      </w:r>
+      <w:proofErr w:type="spellEnd"/>
+      <w:r>
+        <w:t xml:space="preserve"> web o páginas estáticas donde el cliente quiera mostrar información suya para captar clientes.</w:t>
       </w:r>
     </w:p>
     <w:p>
@@ -7070,7 +7123,31 @@
         <w:jc w:val="both"/>
       </w:pPr>
       <w:r>
-        <w:t>- Desarrollo y comercialización de Bsnessapp: plataforma cloud que permite a autónomos y PYMES gestionar tickets, cobros, inventario (artículos y categorías), informes de ventas con filtros avanzados, cierres de caja diarios y control de acceso por roles (administrador / usuario)</w:t>
+        <w:t xml:space="preserve">- Desarrollo y comercialización de </w:t>
+      </w:r>
+      <w:proofErr w:type="spellStart"/>
+      <w:r>
+        <w:t>Bsnessapp</w:t>
+      </w:r>
+      <w:proofErr w:type="spellEnd"/>
+      <w:r>
+        <w:t xml:space="preserve">: plataforma </w:t>
+      </w:r>
+      <w:proofErr w:type="spellStart"/>
+      <w:r>
+        <w:t>cloud</w:t>
+      </w:r>
+      <w:proofErr w:type="spellEnd"/>
+      <w:r>
+        <w:t xml:space="preserve"> que permite a autónomos y PYMES gestionar </w:t>
+      </w:r>
+      <w:proofErr w:type="gramStart"/>
+      <w:r>
+        <w:t>tickets</w:t>
+      </w:r>
+      <w:proofErr w:type="gramEnd"/>
+      <w:r>
+        <w:t>, cobros, inventario (artículos y categorías), informes de ventas con filtros avanzados, cierres de caja diarios y control de acceso por roles (administrador / usuario)</w:t>
       </w:r>
     </w:p>
     <w:p>
@@ -7088,7 +7165,31 @@
         <w:jc w:val="both"/>
       </w:pPr>
       <w:r>
-        <w:t>Desde Xiaomao devs buscamos dar solución a un problema que afecta a miles de autónomos y pequeñas empresas que tienen que recurrir a costosos TPVs tradicionales donde se caracterizan por ser complejos de configurar, trabajan en local y no tienen un buen sistema de copias de seguridad en la nube.</w:t>
+        <w:t xml:space="preserve">Desde </w:t>
+      </w:r>
+      <w:proofErr w:type="spellStart"/>
+      <w:r>
+        <w:t>Xiaomao</w:t>
+      </w:r>
+      <w:proofErr w:type="spellEnd"/>
+      <w:r>
+        <w:t xml:space="preserve"> </w:t>
+      </w:r>
+      <w:proofErr w:type="spellStart"/>
+      <w:r>
+        <w:t>devs</w:t>
+      </w:r>
+      <w:proofErr w:type="spellEnd"/>
+      <w:r>
+        <w:t xml:space="preserve"> buscamos dar solución a un problema que afecta a miles de autónomos y pequeñas empresas que tienen que recurrir a costosos </w:t>
+      </w:r>
+      <w:proofErr w:type="spellStart"/>
+      <w:r>
+        <w:t>TPVs</w:t>
+      </w:r>
+      <w:proofErr w:type="spellEnd"/>
+      <w:r>
+        <w:t xml:space="preserve"> tradicionales donde se caracterizan por ser complejos de configurar, trabajan en local y no tienen un buen sistema de copias de seguridad en la nube.</w:t>
       </w:r>
     </w:p>
     <w:p>
@@ -7120,7 +7221,15 @@
         <w:jc w:val="both"/>
       </w:pPr>
       <w:r>
-        <w:t>- Enfoque en sostenibilidad: tickets digitales por email en lugar de impresión en papel, pensando en una mentalidad sostenible y respetuoso con el medioambiente.</w:t>
+        <w:t xml:space="preserve">- Enfoque en sostenibilidad: </w:t>
+      </w:r>
+      <w:proofErr w:type="gramStart"/>
+      <w:r>
+        <w:t>tickets</w:t>
+      </w:r>
+      <w:proofErr w:type="gramEnd"/>
+      <w:r>
+        <w:t xml:space="preserve"> digitales por email en lugar de impresión en papel, pensando en una mentalidad sostenible y respetuoso con el medioambiente.</w:t>
       </w:r>
     </w:p>
     <w:p>
@@ -7137,7 +7246,15 @@
       </w:pPr>
       <w:r>
         <w:lastRenderedPageBreak/>
-        <w:t>Actualmente Xiaomaodevs somos una empresa unipersonal y contamos con un único desarrollador con una larga trayectoria en el mundo de las finanzas y en el desarrollo web.</w:t>
+        <w:t xml:space="preserve">Actualmente </w:t>
+      </w:r>
+      <w:proofErr w:type="spellStart"/>
+      <w:r>
+        <w:t>Xiaomaodevs</w:t>
+      </w:r>
+      <w:proofErr w:type="spellEnd"/>
+      <w:r>
+        <w:t xml:space="preserve"> somos una empresa unipersonal y contamos con un único desarrollador con una larga trayectoria en el mundo de las finanzas y en el desarrollo web.</w:t>
       </w:r>
     </w:p>
     <w:p>
@@ -7184,19 +7301,43 @@
         <w:jc w:val="both"/>
       </w:pPr>
       <w:r>
-        <w:t>Nuestro principal desarrollador es Fu Jun Fu Lin titulado en Grado en Superior de FP en Desarrollo de Aplicaciones Web en el IES L’</w:t>
+        <w:t xml:space="preserve">Nuestro principal desarrollador es Fu Jun Fu Lin titulado en Grado en Superior de FP en Desarrollo de Aplicaciones Web en el IES </w:t>
+      </w:r>
+      <w:proofErr w:type="spellStart"/>
+      <w:r>
+        <w:t>L’</w:t>
       </w:r>
       <w:r>
         <w:t>E</w:t>
       </w:r>
       <w:r>
-        <w:t>stació, además cuenta con una titulación de Administración de Empresas especializado en finanzas por la Universidad de Valencia.</w:t>
+        <w:t>stació</w:t>
+      </w:r>
+      <w:proofErr w:type="spellEnd"/>
+      <w:r>
+        <w:t>, además cuenta con una titulación de Administración de Empresas especializado en finanzas por la Universidad de Valencia.</w:t>
       </w:r>
       <w:r>
         <w:t xml:space="preserve"> Es un desarrollador fanático de la programación que cuenta con una e</w:t>
       </w:r>
       <w:r>
-        <w:t>xperiencia laboral en el mundo del desarrollo X años donde ha trabajado con diferentes equipos de desarrollo como Fullstack Developer.</w:t>
+        <w:t xml:space="preserve">xperiencia laboral en el mundo del desarrollo X años donde ha trabajado con diferentes equipos de desarrollo como </w:t>
+      </w:r>
+      <w:proofErr w:type="spellStart"/>
+      <w:r>
+        <w:t>Fullstack</w:t>
+      </w:r>
+      <w:proofErr w:type="spellEnd"/>
+      <w:r>
+        <w:t xml:space="preserve"> </w:t>
+      </w:r>
+      <w:proofErr w:type="spellStart"/>
+      <w:r>
+        <w:t>Developer</w:t>
+      </w:r>
+      <w:proofErr w:type="spellEnd"/>
+      <w:r>
+        <w:t>.</w:t>
       </w:r>
     </w:p>
     <w:p>
@@ -7223,9 +7364,11 @@
       <w:r>
         <w:t xml:space="preserve">, </w:t>
       </w:r>
+      <w:proofErr w:type="spellStart"/>
       <w:r>
         <w:t>PostgresSQL</w:t>
       </w:r>
+      <w:proofErr w:type="spellEnd"/>
       <w:r>
         <w:t xml:space="preserve">, </w:t>
       </w:r>
@@ -7242,8 +7385,13 @@
         <w:t xml:space="preserve">, </w:t>
       </w:r>
       <w:r>
-        <w:t>CSS y Tailwind</w:t>
-      </w:r>
+        <w:t xml:space="preserve">CSS y </w:t>
+      </w:r>
+      <w:proofErr w:type="spellStart"/>
+      <w:r>
+        <w:t>Tailwind</w:t>
+      </w:r>
+      <w:proofErr w:type="spellEnd"/>
       <w:r>
         <w:t xml:space="preserve">. </w:t>
       </w:r>
@@ -7269,7 +7417,15 @@
         <w:t xml:space="preserve"> diferentes fases de desarrollos de aplicaciones</w:t>
       </w:r>
       <w:r>
-        <w:t xml:space="preserve">, como ChatGPT, Claude o </w:t>
+        <w:t xml:space="preserve">, como </w:t>
+      </w:r>
+      <w:proofErr w:type="spellStart"/>
+      <w:r>
+        <w:t>ChatGPT</w:t>
+      </w:r>
+      <w:proofErr w:type="spellEnd"/>
+      <w:r>
+        <w:t xml:space="preserve">, Claude o </w:t>
       </w:r>
       <w:r>
         <w:t>Gemini.</w:t>
@@ -7305,7 +7461,15 @@
         <w:t>Como identidad de marca hemos buscado una identidad que sea fácil de recordar y agradable a la vista</w:t>
       </w:r>
       <w:r>
-        <w:t>. Mediante nuestra identidad de marca buscamos enfocarnos a cierto público objetivo: autónomos, PYMES y pequeños negocios del retail, hostelería y servicios que buscan soluciones prácticas, modernas y accesibles.</w:t>
+        <w:t xml:space="preserve">. Mediante nuestra identidad de marca buscamos enfocarnos a cierto público objetivo: autónomos, PYMES y pequeños negocios del </w:t>
+      </w:r>
+      <w:proofErr w:type="spellStart"/>
+      <w:r>
+        <w:t>retail</w:t>
+      </w:r>
+      <w:proofErr w:type="spellEnd"/>
+      <w:r>
+        <w:t>, hostelería y servicios que buscan soluciones prácticas, modernas y accesibles.</w:t>
       </w:r>
     </w:p>
     <w:p>
@@ -7328,9 +7492,15 @@
       <w:pPr>
         <w:jc w:val="both"/>
       </w:pPr>
-      <w:r>
-        <w:t xml:space="preserve">Xiaomaodevs es un nombre que a nuestro parecer es fácil de recordar y se compone de dos partes: </w:t>
-      </w:r>
+      <w:proofErr w:type="spellStart"/>
+      <w:r>
+        <w:t>Xiaomaodevs</w:t>
+      </w:r>
+      <w:proofErr w:type="spellEnd"/>
+      <w:r>
+        <w:t xml:space="preserve"> es un nombre que a nuestro parecer es fácil de recordar y se compone de dos partes: </w:t>
+      </w:r>
+      <w:proofErr w:type="spellStart"/>
       <w:r>
         <w:rPr>
           <w:i/>
@@ -7338,8 +7508,17 @@
         </w:rPr>
         <w:t>Xiaomao</w:t>
       </w:r>
-      <w:r>
-        <w:t xml:space="preserve"> o pequeño gato en chino y devs de desarrollo de software. Con esta simbiosis conseguimos un distintivo dentro de un sector dominado por nombres genéricos y mantiene una identidad coherente con nuestro perfil técnico empresarial.</w:t>
+      <w:proofErr w:type="spellEnd"/>
+      <w:r>
+        <w:t xml:space="preserve"> o pequeño gato en chino y </w:t>
+      </w:r>
+      <w:proofErr w:type="spellStart"/>
+      <w:r>
+        <w:t>devs</w:t>
+      </w:r>
+      <w:proofErr w:type="spellEnd"/>
+      <w:r>
+        <w:t xml:space="preserve"> de desarrollo de software. Con esta simbiosis conseguimos un distintivo dentro de un sector dominado por nombres genéricos y mantiene una identidad coherente con nuestro perfil técnico empresarial.</w:t>
       </w:r>
     </w:p>
     <w:p>
@@ -7437,7 +7616,15 @@
         </w:r>
       </w:fldSimple>
       <w:r>
-        <w:t>. Xiaomaodevs logo</w:t>
+        <w:t xml:space="preserve">. </w:t>
+      </w:r>
+      <w:proofErr w:type="spellStart"/>
+      <w:r>
+        <w:t>Xiaomaodevs</w:t>
+      </w:r>
+      <w:proofErr w:type="spellEnd"/>
+      <w:r>
+        <w:t xml:space="preserve"> logo</w:t>
       </w:r>
       <w:r>
         <w:t xml:space="preserve"> – Imagen generada por IA</w:t>
@@ -7449,7 +7636,23 @@
       </w:pPr>
       <w:r>
         <w:lastRenderedPageBreak/>
-        <w:t>El diseño del logo de Xiaomaodevs tiene forma de gato ya que Xiaomao viene de gatito en chino que junto a la etiqueta de cerrado de HTML queremos darle un toque minimalista al nuestro logo que sea fácil de escalar a distintos soportes (web, tarjetas o redes sociales).</w:t>
+        <w:t xml:space="preserve">El diseño del logo de </w:t>
+      </w:r>
+      <w:proofErr w:type="spellStart"/>
+      <w:r>
+        <w:t>Xiaomaodevs</w:t>
+      </w:r>
+      <w:proofErr w:type="spellEnd"/>
+      <w:r>
+        <w:t xml:space="preserve"> tiene forma de gato ya que </w:t>
+      </w:r>
+      <w:proofErr w:type="spellStart"/>
+      <w:r>
+        <w:t>Xiaomao</w:t>
+      </w:r>
+      <w:proofErr w:type="spellEnd"/>
+      <w:r>
+        <w:t xml:space="preserve"> viene de gatito en chino que junto a la etiqueta de cerrado de HTML queremos darle un toque minimalista al nuestro logo que sea fácil de escalar a distintos soportes (web, tarjetas o redes sociales).</w:t>
       </w:r>
       <w:r>
         <w:t xml:space="preserve"> </w:t>
@@ -7469,7 +7672,23 @@
         <w:t xml:space="preserve"> alineado </w:t>
       </w:r>
       <w:r>
-        <w:t>con los colores de la web Bsnessapp (azul y cyan) para mantener una coherencia visual entre nuestra marca y el producto.</w:t>
+        <w:t xml:space="preserve">con los colores de la web </w:t>
+      </w:r>
+      <w:proofErr w:type="spellStart"/>
+      <w:r>
+        <w:t>Bsnessapp</w:t>
+      </w:r>
+      <w:proofErr w:type="spellEnd"/>
+      <w:r>
+        <w:t xml:space="preserve"> (azul y </w:t>
+      </w:r>
+      <w:proofErr w:type="spellStart"/>
+      <w:r>
+        <w:t>cyan</w:t>
+      </w:r>
+      <w:proofErr w:type="spellEnd"/>
+      <w:r>
+        <w:t>) para mantener una coherencia visual entre nuestra marca y el producto.</w:t>
       </w:r>
     </w:p>
     <w:p>
@@ -7532,7 +7751,15 @@
         </w:rPr>
       </w:pPr>
       <w:r>
-        <w:t>Por otro lado, en nuestra app tenemos el siguiente eslogan:</w:t>
+        <w:t xml:space="preserve">Por otro lado, en nuestra </w:t>
+      </w:r>
+      <w:proofErr w:type="gramStart"/>
+      <w:r>
+        <w:t>app</w:t>
+      </w:r>
+      <w:proofErr w:type="gramEnd"/>
+      <w:r>
+        <w:t xml:space="preserve"> tenemos el siguiente eslogan:</w:t>
       </w:r>
       <w:r>
         <w:br/>
@@ -7724,7 +7951,15 @@
         </w:numPr>
       </w:pPr>
       <w:r>
-        <w:t>Uso del sistema Verifactu.</w:t>
+        <w:t xml:space="preserve">Uso del sistema </w:t>
+      </w:r>
+      <w:proofErr w:type="spellStart"/>
+      <w:r>
+        <w:t>Verifactu</w:t>
+      </w:r>
+      <w:proofErr w:type="spellEnd"/>
+      <w:r>
+        <w:t>.</w:t>
       </w:r>
     </w:p>
     <w:p>
@@ -7770,7 +8005,15 @@
         </w:numPr>
       </w:pPr>
       <w:r>
-        <w:t>Tecnologías modernas (React, Next.js, APIs) que permiten desarrollar productos ágiles y mantenibles.</w:t>
+        <w:t xml:space="preserve">Tecnologías modernas (React, Next.js, </w:t>
+      </w:r>
+      <w:proofErr w:type="spellStart"/>
+      <w:r>
+        <w:t>APIs</w:t>
+      </w:r>
+      <w:proofErr w:type="spellEnd"/>
+      <w:r>
+        <w:t>) que permiten desarrollar productos ágiles y mantenibles.</w:t>
       </w:r>
     </w:p>
     <w:p>
@@ -7788,13 +8031,29 @@
         <w:jc w:val="both"/>
       </w:pPr>
       <w:r>
-        <w:t xml:space="preserve">El entorno favorece la adopción de soluciones como Bsnessapp, orientadas a la digitalización, la accesibilidad y el cumplimiento normativo con una inversión controlada. Por otro lado, uno de los mayores problemas que se enfrenta nuestra aplicación </w:t>
+        <w:t xml:space="preserve">El entorno favorece la adopción de soluciones como </w:t>
+      </w:r>
+      <w:proofErr w:type="spellStart"/>
+      <w:r>
+        <w:t>Bsnessapp</w:t>
+      </w:r>
+      <w:proofErr w:type="spellEnd"/>
+      <w:r>
+        <w:t xml:space="preserve">, orientadas a la digitalización, la accesibilidad y el cumplimiento normativo con una inversión controlada. Por otro lado, uno de los mayores problemas que se enfrenta nuestra aplicación </w:t>
       </w:r>
       <w:r>
         <w:t xml:space="preserve">o modelo de negocio </w:t>
       </w:r>
       <w:r>
-        <w:t>es la excesiva normativa y burocracia que tenemos que aplicar para poder vender nuestra aplicación, como puede ser la implementación de sistemas como Verifactu o el registro y trazabilidad de todos lo</w:t>
+        <w:t xml:space="preserve">es la excesiva normativa y burocracia que tenemos que aplicar para poder vender nuestra aplicación, como puede ser la implementación de sistemas como </w:t>
+      </w:r>
+      <w:proofErr w:type="spellStart"/>
+      <w:r>
+        <w:t>Verifactu</w:t>
+      </w:r>
+      <w:proofErr w:type="spellEnd"/>
+      <w:r>
+        <w:t xml:space="preserve"> o el registro y trazabilidad de todos lo</w:t>
       </w:r>
       <w:r>
         <w:t>s</w:t>
@@ -7911,8 +8170,13 @@
             <w:pPr>
               <w:spacing w:after="160" w:line="259" w:lineRule="auto"/>
             </w:pPr>
-            <w:r>
-              <w:t>SumUp, Square</w:t>
+            <w:proofErr w:type="spellStart"/>
+            <w:r>
+              <w:t>SumUp</w:t>
+            </w:r>
+            <w:proofErr w:type="spellEnd"/>
+            <w:r>
+              <w:t>, Square</w:t>
             </w:r>
           </w:p>
         </w:tc>
@@ -7961,8 +8225,13 @@
             <w:pPr>
               <w:spacing w:after="160" w:line="259" w:lineRule="auto"/>
             </w:pPr>
-            <w:r>
-              <w:t>Holded, Quipu</w:t>
+            <w:proofErr w:type="spellStart"/>
+            <w:r>
+              <w:t>Holded</w:t>
+            </w:r>
+            <w:proofErr w:type="spellEnd"/>
+            <w:r>
+              <w:t>, Quipu</w:t>
             </w:r>
           </w:p>
         </w:tc>
@@ -8014,8 +8283,21 @@
             <w:pPr>
               <w:spacing w:after="160" w:line="259" w:lineRule="auto"/>
             </w:pPr>
-            <w:r>
-              <w:t>Debitoor (SumUp)</w:t>
+            <w:proofErr w:type="spellStart"/>
+            <w:r>
+              <w:t>Debitoor</w:t>
+            </w:r>
+            <w:proofErr w:type="spellEnd"/>
+            <w:r>
+              <w:t xml:space="preserve"> (</w:t>
+            </w:r>
+            <w:proofErr w:type="spellStart"/>
+            <w:r>
+              <w:t>SumUp</w:t>
+            </w:r>
+            <w:proofErr w:type="spellEnd"/>
+            <w:r>
+              <w:t>)</w:t>
             </w:r>
           </w:p>
         </w:tc>
@@ -8060,9 +8342,11 @@
             <w:vAlign w:val="center"/>
           </w:tcPr>
           <w:p>
+            <w:proofErr w:type="spellStart"/>
             <w:r>
               <w:t>Odoo</w:t>
             </w:r>
+            <w:proofErr w:type="spellEnd"/>
           </w:p>
         </w:tc>
         <w:tc>
@@ -8114,7 +8398,15 @@
       </w:pPr>
       <w:r>
         <w:lastRenderedPageBreak/>
-        <w:t>En Xiaomaodevs buscamos diferenciarnos mediante estos aspectos:</w:t>
+        <w:t xml:space="preserve">En </w:t>
+      </w:r>
+      <w:proofErr w:type="spellStart"/>
+      <w:r>
+        <w:t>Xiaomaodevs</w:t>
+      </w:r>
+      <w:proofErr w:type="spellEnd"/>
+      <w:r>
+        <w:t xml:space="preserve"> buscamos diferenciarnos mediante estos aspectos:</w:t>
       </w:r>
     </w:p>
     <w:p>
@@ -8144,7 +8436,15 @@
         </w:numPr>
       </w:pPr>
       <w:r>
-        <w:t>Producto TPV cloud específico, no solo facturación.</w:t>
+        <w:t xml:space="preserve">Producto TPV </w:t>
+      </w:r>
+      <w:proofErr w:type="spellStart"/>
+      <w:r>
+        <w:t>cloud</w:t>
+      </w:r>
+      <w:proofErr w:type="spellEnd"/>
+      <w:r>
+        <w:t xml:space="preserve"> específico, no solo facturación.</w:t>
       </w:r>
     </w:p>
     <w:p>
@@ -8176,8 +8476,13 @@
           <w:numId w:val="19"/>
         </w:numPr>
       </w:pPr>
-      <w:r>
-        <w:t>Tickets digitales por email como alternativa sostenible a la impresión en papel.</w:t>
+      <w:proofErr w:type="gramStart"/>
+      <w:r>
+        <w:t>Tickets</w:t>
+      </w:r>
+      <w:proofErr w:type="gramEnd"/>
+      <w:r>
+        <w:t xml:space="preserve"> digitales por email como alternativa sostenible a la impresión en papel.</w:t>
       </w:r>
     </w:p>
     <w:p>
@@ -8375,7 +8680,15 @@
         <w:jc w:val="both"/>
       </w:pPr>
       <w:r>
-        <w:t>Normativa de factura electrónica que impulsa la adopción de herramientas cloud.</w:t>
+        <w:t xml:space="preserve">Normativa de factura electrónica que impulsa la adopción de herramientas </w:t>
+      </w:r>
+      <w:proofErr w:type="spellStart"/>
+      <w:r>
+        <w:t>cloud</w:t>
+      </w:r>
+      <w:proofErr w:type="spellEnd"/>
+      <w:r>
+        <w:t>.</w:t>
       </w:r>
     </w:p>
     <w:p>
@@ -8387,7 +8700,28 @@
         <w:jc w:val="both"/>
       </w:pPr>
       <w:r>
-        <w:t>Demanda de soluciones eco-friendly (tickets digitales).</w:t>
+        <w:t xml:space="preserve">Demanda de soluciones </w:t>
+      </w:r>
+      <w:proofErr w:type="gramStart"/>
+      <w:r>
+        <w:t>eco-</w:t>
+      </w:r>
+      <w:proofErr w:type="spellStart"/>
+      <w:r>
+        <w:t>friendly</w:t>
+      </w:r>
+      <w:proofErr w:type="spellEnd"/>
+      <w:proofErr w:type="gramEnd"/>
+      <w:r>
+        <w:t xml:space="preserve"> (</w:t>
+      </w:r>
+      <w:proofErr w:type="gramStart"/>
+      <w:r>
+        <w:t>tickets</w:t>
+      </w:r>
+      <w:proofErr w:type="gramEnd"/>
+      <w:r>
+        <w:t xml:space="preserve"> digitales).</w:t>
       </w:r>
     </w:p>
     <w:p>
@@ -8586,7 +8920,31 @@
         <w:t>Fortalezas + Oportunidades</w:t>
       </w:r>
       <w:r>
-        <w:t>: Ofrecer Bsnessapp como alternativa ágil y económica en nichos específicos (hostelería pequeña, retail local), aprovechando la flexibilidad y el stack moderno.</w:t>
+        <w:t xml:space="preserve">: Ofrecer </w:t>
+      </w:r>
+      <w:proofErr w:type="spellStart"/>
+      <w:r>
+        <w:t>Bsnessapp</w:t>
+      </w:r>
+      <w:proofErr w:type="spellEnd"/>
+      <w:r>
+        <w:t xml:space="preserve"> como alternativa ágil y económica en nichos específicos (hostelería pequeña, </w:t>
+      </w:r>
+      <w:proofErr w:type="spellStart"/>
+      <w:r>
+        <w:t>retail</w:t>
+      </w:r>
+      <w:proofErr w:type="spellEnd"/>
+      <w:r>
+        <w:t xml:space="preserve"> local), aprovechando la flexibilidad y el </w:t>
+      </w:r>
+      <w:proofErr w:type="spellStart"/>
+      <w:r>
+        <w:t>stack</w:t>
+      </w:r>
+      <w:proofErr w:type="spellEnd"/>
+      <w:r>
+        <w:t xml:space="preserve"> moderno.</w:t>
       </w:r>
     </w:p>
     <w:p>
@@ -8605,7 +8963,15 @@
         <w:t>Fortalezas + Amenazas</w:t>
       </w:r>
       <w:r>
-        <w:t>: Mantener la diferenciación por simplicidad, soporte cercano y enfoque en sostenibilidad, evitando competir solo por precio con grandes players.</w:t>
+        <w:t xml:space="preserve">: Mantener la diferenciación por simplicidad, soporte cercano y enfoque en sostenibilidad, evitando competir solo por precio con grandes </w:t>
+      </w:r>
+      <w:proofErr w:type="spellStart"/>
+      <w:r>
+        <w:t>players</w:t>
+      </w:r>
+      <w:proofErr w:type="spellEnd"/>
+      <w:r>
+        <w:t>.</w:t>
       </w:r>
     </w:p>
     <w:p>
@@ -8683,7 +9049,15 @@
         <w:jc w:val="both"/>
       </w:pPr>
       <w:r>
-        <w:t xml:space="preserve">En Xiaomaodevs nos hemos propuesto un objetivos y valores </w:t>
+        <w:t xml:space="preserve">En </w:t>
+      </w:r>
+      <w:proofErr w:type="spellStart"/>
+      <w:r>
+        <w:t>Xiaomaodevs</w:t>
+      </w:r>
+      <w:proofErr w:type="spellEnd"/>
+      <w:r>
+        <w:t xml:space="preserve"> nos hemos propuesto un objetivos y valores </w:t>
       </w:r>
       <w:r>
         <w:t>realistas</w:t>
@@ -8849,7 +9223,15 @@
         <w:jc w:val="both"/>
       </w:pPr>
       <w:r>
-        <w:t>Por último, en Xiaomaodevs somos muy conscientes de la sostenibilidad o de los ODS (objetivos de desarrollo sostenible) por cual creemos que cumpliremos con los siguiente:</w:t>
+        <w:t xml:space="preserve">Por último, en </w:t>
+      </w:r>
+      <w:proofErr w:type="spellStart"/>
+      <w:r>
+        <w:t>Xiaomaodevs</w:t>
+      </w:r>
+      <w:proofErr w:type="spellEnd"/>
+      <w:r>
+        <w:t xml:space="preserve"> somos muy conscientes de la sostenibilidad o de los ODS (objetivos de desarrollo sostenible) por cual creemos que cumpliremos con los siguiente:</w:t>
       </w:r>
       <w:r>
         <w:br/>
@@ -8909,7 +9291,15 @@
         <w:t>ODS 12 (Producción y consumo responsables)</w:t>
       </w:r>
       <w:r>
-        <w:t>: Promover tickets digitales en lugar de impresión en papel, reduciendo el consumo de recursos.</w:t>
+        <w:t xml:space="preserve">: Promover </w:t>
+      </w:r>
+      <w:proofErr w:type="gramStart"/>
+      <w:r>
+        <w:t>tickets</w:t>
+      </w:r>
+      <w:proofErr w:type="gramEnd"/>
+      <w:r>
+        <w:t xml:space="preserve"> digitales en lugar de impresión en papel, reduciendo el consumo de recursos.</w:t>
       </w:r>
     </w:p>
     <w:p>
@@ -8917,7 +9307,15 @@
         <w:jc w:val="both"/>
       </w:pPr>
       <w:r>
-        <w:t xml:space="preserve">En resumen, podemos decir que en Xiaomaodevs nos sentimos orgullos por nuestro compromiso por la </w:t>
+        <w:t xml:space="preserve">En resumen, podemos decir que en </w:t>
+      </w:r>
+      <w:proofErr w:type="spellStart"/>
+      <w:r>
+        <w:t>Xiaomaodevs</w:t>
+      </w:r>
+      <w:proofErr w:type="spellEnd"/>
+      <w:r>
+        <w:t xml:space="preserve"> nos sentimos orgullos por nuestro compromiso por la </w:t>
       </w:r>
       <w:r>
         <w:t>sostenibilidad</w:t>
@@ -8926,7 +9324,23 @@
         <w:t xml:space="preserve"> </w:t>
       </w:r>
       <w:r>
-        <w:t xml:space="preserve">pues nuestra propuesta principal, Bsnessapp, encaja en estos ODS mediante la simplicidad, la nube y tickets por email. </w:t>
+        <w:t xml:space="preserve">pues nuestra propuesta principal, </w:t>
+      </w:r>
+      <w:proofErr w:type="spellStart"/>
+      <w:r>
+        <w:t>Bsnessapp</w:t>
+      </w:r>
+      <w:proofErr w:type="spellEnd"/>
+      <w:r>
+        <w:t xml:space="preserve">, encaja en estos ODS mediante la simplicidad, la nube y </w:t>
+      </w:r>
+      <w:proofErr w:type="gramStart"/>
+      <w:r>
+        <w:t>tickets</w:t>
+      </w:r>
+      <w:proofErr w:type="gramEnd"/>
+      <w:r>
+        <w:t xml:space="preserve"> por email. </w:t>
       </w:r>
     </w:p>
     <w:p>
@@ -8950,7 +9364,15 @@
         <w:jc w:val="both"/>
       </w:pPr>
       <w:r>
-        <w:t xml:space="preserve"> En Bsnessapp, actualmente estamos enfocados principalmente al mercado español</w:t>
+        <w:t xml:space="preserve"> En </w:t>
+      </w:r>
+      <w:proofErr w:type="spellStart"/>
+      <w:r>
+        <w:t>Bsnessapp</w:t>
+      </w:r>
+      <w:proofErr w:type="spellEnd"/>
+      <w:r>
+        <w:t>, actualmente estamos enfocados principalmente al mercado español</w:t>
       </w:r>
       <w:r>
         <w:t>, donde existe una gran base de autónomos y de pequeñas y medianas empresas que necesitan soluciones accesibles y eficientes para gestionar sus ventas. La idea es empezar validando el modelo en nuestro entorno cercano, entendiendo bien las necesidades reales de los negocios locales y adaptando el producto a su día a día.</w:t>
@@ -9209,8 +9631,13 @@
               <w:jc w:val="both"/>
               <w:cnfStyle w:val="000000000000" w:firstRow="0" w:lastRow="0" w:firstColumn="0" w:lastColumn="0" w:oddVBand="0" w:evenVBand="0" w:oddHBand="0" w:evenHBand="0" w:firstRowFirstColumn="0" w:firstRowLastColumn="0" w:lastRowFirstColumn="0" w:lastRowLastColumn="0"/>
             </w:pPr>
-            <w:r>
-              <w:t>Tickets rápidos, roles, cierre de caja, informes</w:t>
+            <w:proofErr w:type="gramStart"/>
+            <w:r>
+              <w:t>Tickets</w:t>
+            </w:r>
+            <w:proofErr w:type="gramEnd"/>
+            <w:r>
+              <w:t xml:space="preserve"> rápidos, roles, cierre de caja, informes</w:t>
             </w:r>
           </w:p>
         </w:tc>
@@ -9342,8 +9769,13 @@
               <w:cnfStyle w:val="000000000000" w:firstRow="0" w:lastRow="0" w:firstColumn="0" w:lastColumn="0" w:oddVBand="0" w:evenVBand="0" w:oddHBand="0" w:evenHBand="0" w:firstRowFirstColumn="0" w:firstRowLastColumn="0" w:lastRowFirstColumn="0" w:lastRowLastColumn="0"/>
             </w:pPr>
             <w:r>
-              <w:t>Varios usuarios, posible multi-sede</w:t>
-            </w:r>
+              <w:t xml:space="preserve">Varios usuarios, posible </w:t>
+            </w:r>
+            <w:proofErr w:type="spellStart"/>
+            <w:r>
+              <w:t>multi-sede</w:t>
+            </w:r>
+            <w:proofErr w:type="spellEnd"/>
           </w:p>
         </w:tc>
         <w:tc>
@@ -9435,7 +9867,15 @@
         <w:jc w:val="both"/>
       </w:pPr>
       <w:r>
-        <w:t>Tienen una necesidad clara de TPV cloud.</w:t>
+        <w:t xml:space="preserve">Tienen una necesidad clara de TPV </w:t>
+      </w:r>
+      <w:proofErr w:type="spellStart"/>
+      <w:r>
+        <w:t>cloud</w:t>
+      </w:r>
+      <w:proofErr w:type="spellEnd"/>
+      <w:r>
+        <w:t>.</w:t>
       </w:r>
     </w:p>
     <w:p>
@@ -9465,7 +9905,28 @@
         <w:jc w:val="both"/>
       </w:pPr>
       <w:r>
-        <w:t>Pueden beneficiarse de tickets digitales y herramientas eco-friendly.</w:t>
+        <w:t xml:space="preserve">Pueden beneficiarse de </w:t>
+      </w:r>
+      <w:proofErr w:type="gramStart"/>
+      <w:r>
+        <w:t>tickets</w:t>
+      </w:r>
+      <w:proofErr w:type="gramEnd"/>
+      <w:r>
+        <w:t xml:space="preserve"> digitales y herramientas </w:t>
+      </w:r>
+      <w:proofErr w:type="gramStart"/>
+      <w:r>
+        <w:t>eco-</w:t>
+      </w:r>
+      <w:proofErr w:type="spellStart"/>
+      <w:r>
+        <w:t>friendly</w:t>
+      </w:r>
+      <w:proofErr w:type="spellEnd"/>
+      <w:proofErr w:type="gramEnd"/>
+      <w:r>
+        <w:t>.</w:t>
       </w:r>
     </w:p>
     <w:p>
@@ -9501,7 +9962,23 @@
           <w:i/>
           <w:iCs/>
         </w:rPr>
-        <w:t>"Bsnessapp es el TPV en la nube que simplifica la facturación y la gestión de ventas para autónomos y PYMES, con precios transparentes, soporte técnico cercano y un enfoque sostenible."</w:t>
+        <w:t>"</w:t>
+      </w:r>
+      <w:proofErr w:type="spellStart"/>
+      <w:r>
+        <w:rPr>
+          <w:i/>
+          <w:iCs/>
+        </w:rPr>
+        <w:t>Bsnessapp</w:t>
+      </w:r>
+      <w:proofErr w:type="spellEnd"/>
+      <w:r>
+        <w:rPr>
+          <w:i/>
+          <w:iCs/>
+        </w:rPr>
+        <w:t xml:space="preserve"> es el TPV en la nube que simplifica la facturación y la gestión de ventas para autónomos y PYMES, con precios transparentes, soporte técnico cercano y un enfoque sostenible."</w:t>
       </w:r>
     </w:p>
     <w:p>
@@ -9521,8 +9998,13 @@
       <w:pPr>
         <w:jc w:val="both"/>
       </w:pPr>
-      <w:r>
-        <w:t xml:space="preserve">Xiaomaodevs se posiciona como </w:t>
+      <w:proofErr w:type="spellStart"/>
+      <w:r>
+        <w:t>Xiaomaodevs</w:t>
+      </w:r>
+      <w:proofErr w:type="spellEnd"/>
+      <w:r>
+        <w:t xml:space="preserve"> se posiciona como </w:t>
       </w:r>
       <w:r>
         <w:rPr>
@@ -9650,7 +10132,23 @@
         <w:t>Funciones específicas</w:t>
       </w:r>
       <w:r>
-        <w:t>: envío de tickets por email, informes con filtros, control por roles, multi-divisa en Pro.</w:t>
+        <w:t xml:space="preserve">: envío de </w:t>
+      </w:r>
+      <w:proofErr w:type="gramStart"/>
+      <w:r>
+        <w:t>tickets</w:t>
+      </w:r>
+      <w:proofErr w:type="gramEnd"/>
+      <w:r>
+        <w:t xml:space="preserve"> por email, informes con filtros, control por roles, </w:t>
+      </w:r>
+      <w:proofErr w:type="spellStart"/>
+      <w:r>
+        <w:t>multi-divisa</w:t>
+      </w:r>
+      <w:proofErr w:type="spellEnd"/>
+      <w:r>
+        <w:t xml:space="preserve"> en Pro.</w:t>
       </w:r>
     </w:p>
     <w:p>
@@ -9714,13 +10212,22 @@
     </w:p>
     <w:p>
       <w:r>
-        <w:t>Dentro de la estrategia de producto, desde Xiaomaodevs nos basamos en dos pilares:</w:t>
+        <w:t xml:space="preserve">Dentro de la estrategia de producto, desde </w:t>
+      </w:r>
+      <w:proofErr w:type="spellStart"/>
+      <w:r>
+        <w:t>Xiaomaodevs</w:t>
+      </w:r>
+      <w:proofErr w:type="spellEnd"/>
+      <w:r>
+        <w:t xml:space="preserve"> nos basamos en dos pilares:</w:t>
       </w:r>
     </w:p>
     <w:p>
       <w:pPr>
         <w:jc w:val="both"/>
       </w:pPr>
+      <w:proofErr w:type="spellStart"/>
       <w:r>
         <w:rPr>
           <w:b/>
@@ -9728,6 +10235,7 @@
         </w:rPr>
         <w:t>Bsnessapp</w:t>
       </w:r>
+      <w:proofErr w:type="spellEnd"/>
       <w:r>
         <w:t xml:space="preserve"> como núcleo:</w:t>
       </w:r>
@@ -9741,7 +10249,15 @@
         <w:jc w:val="both"/>
       </w:pPr>
       <w:r>
-        <w:t>Generación de tickets y cobro</w:t>
+        <w:t xml:space="preserve">Generación de </w:t>
+      </w:r>
+      <w:proofErr w:type="gramStart"/>
+      <w:r>
+        <w:t>tickets</w:t>
+      </w:r>
+      <w:proofErr w:type="gramEnd"/>
+      <w:r>
+        <w:t xml:space="preserve"> y cobro</w:t>
       </w:r>
       <w:r>
         <w:t xml:space="preserve"> acceso a periféricos típicos de TPV</w:t>
@@ -9750,7 +10266,15 @@
         <w:t>.</w:t>
       </w:r>
       <w:r>
-        <w:t xml:space="preserve"> Compatibilidad con impresoras térmicas (printer-server).</w:t>
+        <w:t xml:space="preserve"> Compatibilidad con impresoras térmicas (</w:t>
+      </w:r>
+      <w:proofErr w:type="spellStart"/>
+      <w:r>
+        <w:t>printer</w:t>
+      </w:r>
+      <w:proofErr w:type="spellEnd"/>
+      <w:r>
+        <w:t>-server).</w:t>
       </w:r>
     </w:p>
     <w:p>
@@ -9809,8 +10333,13 @@
         </w:numPr>
         <w:jc w:val="both"/>
       </w:pPr>
-      <w:r>
-        <w:t>Tickets digitales por email (PDF).</w:t>
+      <w:proofErr w:type="gramStart"/>
+      <w:r>
+        <w:t>Tickets</w:t>
+      </w:r>
+      <w:proofErr w:type="gramEnd"/>
+      <w:r>
+        <w:t xml:space="preserve"> digitales por email (PDF).</w:t>
       </w:r>
     </w:p>
     <w:p>
@@ -10201,12 +10730,15 @@
       <w:r>
         <w:t xml:space="preserve">Optimización del </w:t>
       </w:r>
+      <w:proofErr w:type="spellStart"/>
       <w:r>
         <w:t>landing</w:t>
       </w:r>
+      <w:proofErr w:type="spellEnd"/>
       <w:r>
         <w:t xml:space="preserve"> page para mostrar al cliente la información importante como la sección de características de nuestra aplicación y el </w:t>
       </w:r>
+      <w:proofErr w:type="spellStart"/>
       <w:r>
         <w:rPr>
           <w:i/>
@@ -10214,6 +10746,7 @@
         </w:rPr>
         <w:t>pricing</w:t>
       </w:r>
+      <w:proofErr w:type="spellEnd"/>
       <w:r>
         <w:t xml:space="preserve"> de nuestro servicio</w:t>
       </w:r>
@@ -10320,7 +10853,15 @@
         <w:t>Colaboraciones</w:t>
       </w:r>
       <w:r>
-        <w:t>: centros formativos e instituciones (ej. IES l’Estació) para demos y casos de uso.</w:t>
+        <w:t xml:space="preserve">: centros formativos e instituciones (ej. IES </w:t>
+      </w:r>
+      <w:proofErr w:type="spellStart"/>
+      <w:r>
+        <w:t>l’Estació</w:t>
+      </w:r>
+      <w:proofErr w:type="spellEnd"/>
+      <w:r>
+        <w:t>) para demos y casos de uso.</w:t>
       </w:r>
     </w:p>
     <w:p>
@@ -10371,8 +10912,13 @@
         <w:t>Creación de a</w:t>
       </w:r>
       <w:r>
-        <w:t>rtículos sobre TPV, facturación para autónomos, cumplimiento fiscal, sostenibilidad en retail</w:t>
-      </w:r>
+        <w:t xml:space="preserve">rtículos sobre TPV, facturación para autónomos, cumplimiento fiscal, sostenibilidad en </w:t>
+      </w:r>
+      <w:proofErr w:type="spellStart"/>
+      <w:r>
+        <w:t>retail</w:t>
+      </w:r>
+      <w:proofErr w:type="spellEnd"/>
       <w:r>
         <w:t xml:space="preserve"> para generar contenidos de calidad con fin de incrementar nuestro posicionamiento y relevancia social.</w:t>
       </w:r>
@@ -10386,15 +10932,41 @@
         <w:jc w:val="both"/>
       </w:pPr>
       <w:r>
-        <w:t xml:space="preserve">Utilizamos herramientas de SEO Keyword Planner para realizar un </w:t>
-      </w:r>
+        <w:t xml:space="preserve">Utilizamos herramientas de SEO </w:t>
+      </w:r>
+      <w:proofErr w:type="spellStart"/>
+      <w:r>
+        <w:t>Keyword</w:t>
+      </w:r>
+      <w:proofErr w:type="spellEnd"/>
+      <w:r>
+        <w:t xml:space="preserve"> </w:t>
+      </w:r>
+      <w:proofErr w:type="spellStart"/>
+      <w:r>
+        <w:t>Planner</w:t>
+      </w:r>
+      <w:proofErr w:type="spellEnd"/>
+      <w:r>
+        <w:t xml:space="preserve"> para realizar un </w:t>
+      </w:r>
+      <w:proofErr w:type="spellStart"/>
       <w:r>
         <w:rPr>
           <w:i/>
           <w:iCs/>
         </w:rPr>
-        <w:t xml:space="preserve">keyword </w:t>
-      </w:r>
+        <w:t>keyword</w:t>
+      </w:r>
+      <w:proofErr w:type="spellEnd"/>
+      <w:r>
+        <w:rPr>
+          <w:i/>
+          <w:iCs/>
+        </w:rPr>
+        <w:t xml:space="preserve"> </w:t>
+      </w:r>
+      <w:proofErr w:type="spellStart"/>
       <w:r>
         <w:rPr>
           <w:i/>
@@ -10402,6 +10974,7 @@
         </w:rPr>
         <w:t>research</w:t>
       </w:r>
+      <w:proofErr w:type="spellEnd"/>
       <w:r>
         <w:t xml:space="preserve"> y</w:t>
       </w:r>
@@ -10421,7 +10994,15 @@
         <w:t xml:space="preserve"> la competencia. Algunas p</w:t>
       </w:r>
       <w:r>
-        <w:t>alabras clave: "TPV cloud", "facturación autónomos", "TPV para cafetería", etc.</w:t>
+        <w:t xml:space="preserve">alabras clave: "TPV </w:t>
+      </w:r>
+      <w:proofErr w:type="spellStart"/>
+      <w:r>
+        <w:t>cloud</w:t>
+      </w:r>
+      <w:proofErr w:type="spellEnd"/>
+      <w:r>
+        <w:t>", "facturación autónomos", "TPV para cafetería", etc.</w:t>
       </w:r>
     </w:p>
     <w:p>
@@ -10442,7 +11023,21 @@
         <w:rPr>
           <w:lang w:val="en-US"/>
         </w:rPr>
-        <w:t>2 Redes sociales (LinkedIn, Twitter/X)</w:t>
+        <w:t xml:space="preserve">2 Redes </w:t>
+      </w:r>
+      <w:proofErr w:type="spellStart"/>
+      <w:r>
+        <w:rPr>
+          <w:lang w:val="en-US"/>
+        </w:rPr>
+        <w:t>sociales</w:t>
+      </w:r>
+      <w:proofErr w:type="spellEnd"/>
+      <w:r>
+        <w:rPr>
+          <w:lang w:val="en-US"/>
+        </w:rPr>
+        <w:t xml:space="preserve"> (LinkedIn, Twitter/X)</w:t>
       </w:r>
       <w:bookmarkEnd w:id="35"/>
     </w:p>
@@ -10469,7 +11064,23 @@
         <w:jc w:val="both"/>
       </w:pPr>
       <w:r>
-        <w:t>Contenido visual (capturas, GIFs, infografías) sobre el uso de Bsnessapp.</w:t>
+        <w:t xml:space="preserve">Contenido visual (capturas, </w:t>
+      </w:r>
+      <w:proofErr w:type="spellStart"/>
+      <w:r>
+        <w:t>GIFs</w:t>
+      </w:r>
+      <w:proofErr w:type="spellEnd"/>
+      <w:r>
+        <w:t xml:space="preserve">, infografías) sobre el uso de </w:t>
+      </w:r>
+      <w:proofErr w:type="spellStart"/>
+      <w:r>
+        <w:t>Bsnessapp</w:t>
+      </w:r>
+      <w:proofErr w:type="spellEnd"/>
+      <w:r>
+        <w:t>.</w:t>
       </w:r>
     </w:p>
     <w:p>
@@ -10503,7 +11114,15 @@
         <w:ind w:firstLine="360"/>
       </w:pPr>
       <w:r>
-        <w:t xml:space="preserve">Aprovechando la reforma del centro IES L’Estació, utilizaremos su nueva cantina como proyecto piloto para mostrar la eficacia y la productividad de nuestra aplicación TPV. Mediante esta prueba piloto, tendremos </w:t>
+        <w:t xml:space="preserve">Aprovechando la reforma del centro IES </w:t>
+      </w:r>
+      <w:proofErr w:type="spellStart"/>
+      <w:r>
+        <w:t>L’Estació</w:t>
+      </w:r>
+      <w:proofErr w:type="spellEnd"/>
+      <w:r>
+        <w:t xml:space="preserve">, utilizaremos su nueva cantina como proyecto piloto para mostrar la eficacia y la productividad de nuestra aplicación TPV. Mediante esta prueba piloto, tendremos </w:t>
       </w:r>
       <w:r>
         <w:t>la prueba práctica como caso de éxito documentando para usar en nuestra web y redes sociales.</w:t>
@@ -10563,7 +11182,15 @@
         <w:jc w:val="both"/>
       </w:pPr>
       <w:r>
-        <w:t>Seguimiento post-registro para resolver dudas y aumentar retención.</w:t>
+        <w:t xml:space="preserve">Seguimiento </w:t>
+      </w:r>
+      <w:proofErr w:type="spellStart"/>
+      <w:r>
+        <w:t>post-registro</w:t>
+      </w:r>
+      <w:proofErr w:type="spellEnd"/>
+      <w:r>
+        <w:t xml:space="preserve"> para resolver dudas y aumentar retención.</w:t>
       </w:r>
     </w:p>
     <w:p>
@@ -10599,8 +11226,29 @@
       <w:pPr>
         <w:jc w:val="both"/>
       </w:pPr>
-      <w:r>
-        <w:t xml:space="preserve">Xiaomaodevs es una empresa unipersonal centrada en la consultoría y desarrollo de software web cuyo producto principal es Bsnessapp, donde ofrece un TPV cloud simple, fácil de instalar y asequible para autónomos y PYMES. </w:t>
+      <w:proofErr w:type="spellStart"/>
+      <w:r>
+        <w:t>Xiaomaodevs</w:t>
+      </w:r>
+      <w:proofErr w:type="spellEnd"/>
+      <w:r>
+        <w:t xml:space="preserve"> es una empresa unipersonal centrada en la consultoría y desarrollo de software web cuyo producto principal es </w:t>
+      </w:r>
+      <w:proofErr w:type="spellStart"/>
+      <w:r>
+        <w:t>Bsnessapp</w:t>
+      </w:r>
+      <w:proofErr w:type="spellEnd"/>
+      <w:r>
+        <w:t xml:space="preserve">, donde ofrece un TPV </w:t>
+      </w:r>
+      <w:proofErr w:type="spellStart"/>
+      <w:r>
+        <w:t>cloud</w:t>
+      </w:r>
+      <w:proofErr w:type="spellEnd"/>
+      <w:r>
+        <w:t xml:space="preserve"> simple, fácil de instalar y asequible para autónomos y PYMES. </w:t>
       </w:r>
     </w:p>
     <w:p>
@@ -10608,7 +11256,15 @@
         <w:jc w:val="both"/>
       </w:pPr>
       <w:r>
-        <w:t>Nuestra propuesta se basa en precios asequibles para el segmento de entrada hasta abarcar precios personalizados para paquetes a medida. También buscamos dar un soporte cercano con tecnologías modernas y muy enfocada en la sostenibilidad con la política de cero papeles mediante la generación y envío de tickets digitales.</w:t>
+        <w:t xml:space="preserve">Nuestra propuesta se basa en precios asequibles para el segmento de entrada hasta abarcar precios personalizados para paquetes a medida. También buscamos dar un soporte cercano con tecnologías modernas y muy enfocada en la sostenibilidad con la política de cero papeles mediante la generación y envío de </w:t>
+      </w:r>
+      <w:proofErr w:type="gramStart"/>
+      <w:r>
+        <w:t>tickets</w:t>
+      </w:r>
+      <w:proofErr w:type="gramEnd"/>
+      <w:r>
+        <w:t xml:space="preserve"> digitales.</w:t>
       </w:r>
     </w:p>
     <w:p>
@@ -10645,7 +11301,13 @@
         <w:t>bastante pocas</w:t>
       </w:r>
       <w:r>
-        <w:t>, los costes iniciales para desplegar nuestra aplicación son bastantes bajas. Los motivos son diversos, pero el mas importante es que los planes gratuitos para desplegar nuestra aplicación pueden absorber el tráfico fácilmente de empresas pequeñas sin que a nosotros nos cueste un dineral en mantenimiento</w:t>
+        <w:t xml:space="preserve">, los costes iniciales para desplegar nuestra aplicación son bastantes bajas. Los motivos son diversos, pero el </w:t>
+      </w:r>
+      <w:r>
+        <w:t>más</w:t>
+      </w:r>
+      <w:r>
+        <w:t xml:space="preserve"> importante es que los planes gratuitos para desplegar nuestra aplicación pueden absorber el tráfico fácilmente de empresas pequeñas sin que a nosotros nos cueste un dineral en mantenimiento</w:t>
       </w:r>
       <w:r>
         <w:t>, con lo cual a la mínima que tengamos unos pocos clientes podemos mantenernos con beneficios.</w:t>
@@ -10656,7 +11318,19 @@
         <w:jc w:val="both"/>
       </w:pPr>
       <w:r>
-        <w:t>El punto negativo que veo a un proyecto como este es que con la irrupción de las IAs, empieza a ver una mercado saturado de proyectos similares creados 100% con IA que en muchos casos no tienen un mantenimiento a largo plazo y dejan tirados sus clientes a los pocos meses, con lo cual hace muy difícil ganarse la confianza de los clientes cuando se es una empresa pequeña de desarrollo de aplicaciones.</w:t>
+        <w:t xml:space="preserve">El punto negativo que veo a un proyecto como este es </w:t>
+      </w:r>
+      <w:r>
+        <w:t>que,</w:t>
+      </w:r>
+      <w:r>
+        <w:t xml:space="preserve"> con la irrupción de las IAs, empieza a ver </w:t>
+      </w:r>
+      <w:r>
+        <w:t>un mercado saturado</w:t>
+      </w:r>
+      <w:r>
+        <w:t xml:space="preserve"> de proyectos similares creados 100% con IA que en muchos casos no tienen un mantenimiento a largo plazo y dejan tirados sus clientes a los pocos meses, con lo cual hace muy difícil ganarse la confianza de los clientes cuando se es una empresa pequeña de desarrollo de aplicaciones.</w:t>
       </w:r>
     </w:p>
     <w:p/>
@@ -10707,14 +11381,7 @@
           <w:b/>
           <w:bCs/>
         </w:rPr>
-        <w:t xml:space="preserve">Apuntes </w:t>
-      </w:r>
-      <w:r>
-        <w:rPr>
-          <w:b/>
-          <w:bCs/>
-        </w:rPr>
-        <w:t xml:space="preserve">Empresa e </w:t>
+        <w:t xml:space="preserve">Apuntes Empresa e </w:t>
       </w:r>
       <w:r>
         <w:rPr>
@@ -10811,8 +11478,13 @@
           <w:numId w:val="15"/>
         </w:numPr>
       </w:pPr>
-      <w:r>
-        <w:t xml:space="preserve">SumUp: </w:t>
+      <w:proofErr w:type="spellStart"/>
+      <w:r>
+        <w:t>SumUp</w:t>
+      </w:r>
+      <w:proofErr w:type="spellEnd"/>
+      <w:r>
+        <w:t xml:space="preserve">: </w:t>
       </w:r>
       <w:hyperlink r:id="rId13" w:history="1">
         <w:r>
@@ -10861,11 +11533,19 @@
           <w:lang w:val="en-US"/>
         </w:rPr>
       </w:pPr>
+      <w:proofErr w:type="spellStart"/>
       <w:r>
         <w:rPr>
           <w:lang w:val="en-US"/>
         </w:rPr>
-        <w:t xml:space="preserve">Holded: </w:t>
+        <w:t>Holded</w:t>
+      </w:r>
+      <w:proofErr w:type="spellEnd"/>
+      <w:r>
+        <w:rPr>
+          <w:lang w:val="en-US"/>
+        </w:rPr>
+        <w:t xml:space="preserve">: </w:t>
       </w:r>
       <w:hyperlink r:id="rId15" w:history="1">
         <w:r>
@@ -10946,7 +11626,39 @@
           <w:b/>
           <w:bCs/>
         </w:rPr>
-        <w:t>Posicionamiento y keywords research:</w:t>
+        <w:t xml:space="preserve">Posicionamiento y </w:t>
+      </w:r>
+      <w:proofErr w:type="spellStart"/>
+      <w:r>
+        <w:rPr>
+          <w:b/>
+          <w:bCs/>
+        </w:rPr>
+        <w:t>keywords</w:t>
+      </w:r>
+      <w:proofErr w:type="spellEnd"/>
+      <w:r>
+        <w:rPr>
+          <w:b/>
+          <w:bCs/>
+        </w:rPr>
+        <w:t xml:space="preserve"> </w:t>
+      </w:r>
+      <w:proofErr w:type="spellStart"/>
+      <w:r>
+        <w:rPr>
+          <w:b/>
+          <w:bCs/>
+        </w:rPr>
+        <w:t>research</w:t>
+      </w:r>
+      <w:proofErr w:type="spellEnd"/>
+      <w:r>
+        <w:rPr>
+          <w:b/>
+          <w:bCs/>
+        </w:rPr>
+        <w:t>:</w:t>
       </w:r>
     </w:p>
     <w:p>
@@ -11048,8 +11760,21 @@
           <w:bCs/>
         </w:rPr>
       </w:pPr>
-      <w:r>
-        <w:t>Odoo POS documentation:</w:t>
+      <w:proofErr w:type="spellStart"/>
+      <w:r>
+        <w:t>Odoo</w:t>
+      </w:r>
+      <w:proofErr w:type="spellEnd"/>
+      <w:r>
+        <w:t xml:space="preserve"> POS </w:t>
+      </w:r>
+      <w:proofErr w:type="spellStart"/>
+      <w:r>
+        <w:t>documentation</w:t>
+      </w:r>
+      <w:proofErr w:type="spellEnd"/>
+      <w:r>
+        <w:t>:</w:t>
       </w:r>
     </w:p>
     <w:p>
@@ -11074,7 +11799,31 @@
         </w:numPr>
       </w:pPr>
       <w:r>
-        <w:t>React thermal printer dependency:</w:t>
+        <w:t xml:space="preserve">React </w:t>
+      </w:r>
+      <w:proofErr w:type="spellStart"/>
+      <w:r>
+        <w:t>thermal</w:t>
+      </w:r>
+      <w:proofErr w:type="spellEnd"/>
+      <w:r>
+        <w:t xml:space="preserve"> </w:t>
+      </w:r>
+      <w:proofErr w:type="spellStart"/>
+      <w:r>
+        <w:t>printer</w:t>
+      </w:r>
+      <w:proofErr w:type="spellEnd"/>
+      <w:r>
+        <w:t xml:space="preserve"> </w:t>
+      </w:r>
+      <w:proofErr w:type="spellStart"/>
+      <w:r>
+        <w:t>dependency</w:t>
+      </w:r>
+      <w:proofErr w:type="spellEnd"/>
+      <w:r>
+        <w:t>:</w:t>
       </w:r>
     </w:p>
     <w:p>
@@ -11098,8 +11847,13 @@
           <w:numId w:val="15"/>
         </w:numPr>
       </w:pPr>
-      <w:r>
-        <w:t>Escpos Project:</w:t>
+      <w:proofErr w:type="spellStart"/>
+      <w:r>
+        <w:t>Escpos</w:t>
+      </w:r>
+      <w:proofErr w:type="spellEnd"/>
+      <w:r>
+        <w:t xml:space="preserve"> Project:</w:t>
       </w:r>
     </w:p>
     <w:p>
@@ -11125,7 +11879,15 @@
         </w:numPr>
       </w:pPr>
       <w:r>
-        <w:t>Node serial port:</w:t>
+        <w:t xml:space="preserve">Node serial </w:t>
+      </w:r>
+      <w:proofErr w:type="spellStart"/>
+      <w:r>
+        <w:t>port</w:t>
+      </w:r>
+      <w:proofErr w:type="spellEnd"/>
+      <w:r>
+        <w:t>:</w:t>
       </w:r>
     </w:p>
     <w:p>
@@ -11150,8 +11912,21 @@
         </w:numPr>
       </w:pPr>
       <w:r>
-        <w:t>Node Thermal Printer</w:t>
-      </w:r>
+        <w:t xml:space="preserve">Node </w:t>
+      </w:r>
+      <w:proofErr w:type="spellStart"/>
+      <w:r>
+        <w:t>Thermal</w:t>
+      </w:r>
+      <w:proofErr w:type="spellEnd"/>
+      <w:r>
+        <w:t xml:space="preserve"> </w:t>
+      </w:r>
+      <w:proofErr w:type="spellStart"/>
+      <w:r>
+        <w:t>Printer</w:t>
+      </w:r>
+      <w:proofErr w:type="spellEnd"/>
     </w:p>
     <w:p>
       <w:pPr>
@@ -20463,6 +21238,7 @@
     <w:rsid w:val="00695FE7"/>
     <w:rsid w:val="006A2219"/>
     <w:rsid w:val="008560F1"/>
+    <w:rsid w:val="008C1A2B"/>
     <w:rsid w:val="009A6098"/>
     <w:rsid w:val="009C3D15"/>
     <w:rsid w:val="009F1FE3"/>
@@ -20474,6 +21250,7 @@
     <w:rsid w:val="00D508C5"/>
     <w:rsid w:val="00E31547"/>
     <w:rsid w:val="00EC183D"/>
+    <w:rsid w:val="00F31637"/>
     <w:rsid w:val="00FA5FD9"/>
     <w:rsid w:val="00FB0E02"/>
   </w:rsids>

</xml_diff>